<commit_message>
Rebuild v3.1 DOCX on HEAD c31d935 (ensemble-vs-k=9 p corrected to 9.10e-8)
Source md now carries 9.10e-08 (5x) and 1.13e-03 (3x); the superseded
9.11e-08 / 9.04e-08 / 1.16e-03 are gone. 12 tables, 81 rows, 387 paragraphs,
6 main + 7 supplementary figure legends.
</commit_message>
<xml_diff>
--- a/NAR_MANUSCRIPT_REVISED_v3.1.docx
+++ b/NAR_MANUSCRIPT_REVISED_v3.1.docx
@@ -7186,7 +7186,7 @@
                 <w:color w:val="000000"/>
                 <w:sz w:val="18"/>
               </w:rPr>
-              <w:t xml:space="preserve"> (p=1.16×10⁻³)</w:t>
+              <w:t xml:space="preserve"> (p=1.13×10⁻³)</w:t>
             </w:r>
           </w:p>
         </w:tc>
@@ -7298,7 +7298,7 @@
                 <w:color w:val="000000"/>
                 <w:sz w:val="18"/>
               </w:rPr>
-              <w:t xml:space="preserve"> (p=9.04×10⁻⁸)</w:t>
+              <w:t xml:space="preserve"> (p=9.10×10⁻⁸)</w:t>
             </w:r>
           </w:p>
         </w:tc>
@@ -7506,7 +7506,7 @@
           <w:color w:val="000000"/>
           <w:sz w:val="24"/>
         </w:rPr>
-        <w:t>The ensemble significantly outperforms contiguous k=9 (0.2005; ensemble better in 81, k=9 better in 32, 17 ties, p=9.04×10⁻⁸, d=0.517).</w:t>
+        <w:t>The ensemble significantly outperforms contiguous k=9 (0.2005; ensemble better in 81, k=9 better in 32, 17 ties, p=9.10×10⁻⁸, d=0.517).</w:t>
       </w:r>
     </w:p>
     <w:p>
@@ -7522,7 +7522,7 @@
           <w:color w:val="000000"/>
           <w:sz w:val="24"/>
         </w:rPr>
-        <w:t>Against the spaced k=5,gap2 configuration under the same NJ-only protocol, the ensemble is significantly better (0.1940 vs 0.2003; ensemble better in 74, spaced NJ-only better in 41, 15 ties, p=1.16×10⁻³, d=0.317). This comparison mixes two changes (multi-k fusion and contiguous-vs-spaced patterns); the like-for-like single-k spaced-vs-contiguous comparison (Table 7, Finding 3) shows the spaced pattern itself is significantly better at k=5 (0.2003 vs 0.2078, p=5.54×10⁻⁴).</w:t>
+        <w:t>Against the spaced k=5,gap2 configuration under the same NJ-only protocol, the ensemble is significantly better (0.1940 vs 0.2003; ensemble better in 74, spaced NJ-only better in 41, 15 ties, p=1.13×10⁻³, d=0.317). This comparison mixes two changes (multi-k fusion and contiguous-vs-spaced patterns); the like-for-like single-k spaced-vs-contiguous comparison (Table 7, Finding 3) shows the spaced pattern itself is significantly better at k=5 (0.2003 vs 0.2078, p=5.54×10⁻⁴).</w:t>
       </w:r>
     </w:p>
     <w:p>
@@ -10732,7 +10732,7 @@
           <w:color w:val="000000"/>
           <w:sz w:val="24"/>
         </w:rPr>
-        <w:t xml:space="preserve"> On this 130-seed INDELible benchmark the multi-k ensemble (contiguous k=5,7,9 average, NJ) achieves TRUE-relative nRF=0.1940 ± 0.0296 — significantly better than the contiguous k=5 baseline (0.2078; ensemble better in 93/130, p=2.22×10⁻¹², d=0.755), than contiguous k=9 (0.2005; 81/130, p=9.04×10⁻⁸, d=0.517), than the NJ-only spaced configuration (0.2003; 74/130, p=1.16×10⁻³, d=0.317) and than the full Fusang pipeline (0.1990; 72/130, p=7.7×10⁻³, d=0.246), while remaining statistically indistinguishable from contiguous k=7 (0.1938; 48/130, p=0.669). In contrast to earlier versions of this manuscript, we therefore claim an accuracy advantage of the multi-k ensemble over the default spaced configuration at L=500 bp — a small one (0.0050 nRF, d=0.246), but significant and reproducible across 130 seeds. Table 4 examines the ensemble against its single-k components in detail. The ensemble's other established benefits are (i) the single-k→multi-k gain under the L=1000 bp protocol (Table 5, d=0.67, p=0.00206; an 8.7% relative reduction in nRF, 0.150→0.137) and (ii) the automatic rescue of the saturating gene-scale default at genome scale (see Real genome benchmarks below).</w:t>
+        <w:t xml:space="preserve"> On this 130-seed INDELible benchmark the multi-k ensemble (contiguous k=5,7,9 average, NJ) achieves TRUE-relative nRF=0.1940 ± 0.0296 — significantly better than the contiguous k=5 baseline (0.2078; ensemble better in 93/130, p=2.22×10⁻¹², d=0.755), than contiguous k=9 (0.2005; 81/130, p=9.10×10⁻⁸, d=0.517), than the NJ-only spaced configuration (0.2003; 74/130, p=1.13×10⁻³, d=0.317) and than the full Fusang pipeline (0.1990; 72/130, p=7.7×10⁻³, d=0.246), while remaining statistically indistinguishable from contiguous k=7 (0.1938; 48/130, p=0.669). In contrast to earlier versions of this manuscript, we therefore claim an accuracy advantage of the multi-k ensemble over the default spaced configuration at L=500 bp — a small one (0.0050 nRF, d=0.246), but significant and reproducible across 130 seeds. Table 4 examines the ensemble against its single-k components in detail. The ensemble's other established benefits are (i) the single-k→multi-k gain under the L=1000 bp protocol (Table 5, d=0.67, p=0.00206; an 8.7% relative reduction in nRF, 0.150→0.137) and (ii) the automatic rescue of the saturating gene-scale default at genome scale (see Real genome benchmarks below).</w:t>
       </w:r>
     </w:p>
     <w:p>
@@ -16370,7 +16370,7 @@
           <w:color w:val="000000"/>
           <w:sz w:val="24"/>
         </w:rPr>
-        <w:t>: The current implementation uses a static k and gap for the entire dataset. On the 130-seed INDELible benchmark (Table 4) the multi-k ensemble (nRF=0.1940) is statistically indistinguishable from the best single contiguous configuration (k=7, 0.1938; p=0.669) and significantly better than the default spaced+NNI pipeline (0.1990; p=0.0077, d=0.246) and than k=5 (0.2078; p=2.22×10⁻¹²) and k=9 (0.2005; p=9.04×10⁻⁸), so at L=500 bp it is the most accurate configuration we tested while requiring no manual k selection. That the ensemble never beats the best single k by a significant margin indicates limited complementary signal beyond what a well-chosen single k captures at this sequence length — the gain over the default is real but small (0.0050 nRF). Because the ranking of k values is likely to shift with sequence length, divergence and taxon count, we do not treat k=7 as a universal optimum. Further optimization, such as weighted fusion, inclusion of spaced k-mers in the ensemble, or per-cluster parameter selection, may yield additional gains. The optimal set of k values and fusion weights has not been systematically explored.</w:t>
+        <w:t>: The current implementation uses a static k and gap for the entire dataset. On the 130-seed INDELible benchmark (Table 4) the multi-k ensemble (nRF=0.1940) is statistically indistinguishable from the best single contiguous configuration (k=7, 0.1938; p=0.669) and significantly better than the default spaced+NNI pipeline (0.1990; p=0.0077, d=0.246) and than k=5 (0.2078; p=2.22×10⁻¹²) and k=9 (0.2005; p=9.10×10⁻⁸), so at L=500 bp it is the most accurate configuration we tested while requiring no manual k selection. That the ensemble never beats the best single k by a significant margin indicates limited complementary signal beyond what a well-chosen single k captures at this sequence length — the gain over the default is real but small (0.0050 nRF). Because the ranking of k values is likely to shift with sequence length, divergence and taxon count, we do not treat k=7 as a universal optimum. Further optimization, such as weighted fusion, inclusion of spaced k-mers in the ensemble, or per-cluster parameter selection, may yield additional gains. The optimal set of k values and fusion weights has not been systematically explored.</w:t>
       </w:r>
     </w:p>
     <w:p>
@@ -18788,7 +18788,7 @@
           <w:color w:val="000000"/>
           <w:sz w:val="24"/>
         </w:rPr>
-        <w:t xml:space="preserve"> Spaced k-mer parameter optimization. (A) nRF heatmap: k (4–8) × gap (0–3) at n=200; the red box marks the default k=5,gap2. (B) Adaptive parameter selection logic: n≤100→k=4,gap1; n&gt;100→k=5,gap2; genome scale (&gt;&gt;1 kb)→multi-k ensemble (k=5 saturates its 1,024 possible 5-mers). (C) Adaptive k,gap selection as a function of dataset size n: k=4,gap1 up to n=100 and k=5,gap2 beyond; 5/5 repeats returned identical selections at every scale (n=20–500), with nRF deviation &lt;0.005 across repeats. (D) Multi-k ensemble (k=5,7,9) vs single-k components and the full pipeline on the 130-seed INDELible benchmark (TRUE-relative): the ensemble significantly beats contiguous k=5 (p=2.22×10⁻¹²) and k=9 (p=9.04×10⁻⁸), ties the best single-k (k=7, p=0.669), and — under the standard root-independent RF — also significantly beats the full spaced+NNI pipeline (0.1940 vs 0.1990, p=7.7×10⁻³), so at L=500 bp the ensemble (or contiguous k=7) is the recommended configuration rather than the default pipeline.</w:t>
+        <w:t xml:space="preserve"> Spaced k-mer parameter optimization. (A) nRF heatmap: k (4–8) × gap (0–3) at n=200; the red box marks the default k=5,gap2. (B) Adaptive parameter selection logic: n≤100→k=4,gap1; n&gt;100→k=5,gap2; genome scale (&gt;&gt;1 kb)→multi-k ensemble (k=5 saturates its 1,024 possible 5-mers). (C) Adaptive k,gap selection as a function of dataset size n: k=4,gap1 up to n=100 and k=5,gap2 beyond; 5/5 repeats returned identical selections at every scale (n=20–500), with nRF deviation &lt;0.005 across repeats. (D) Multi-k ensemble (k=5,7,9) vs single-k components and the full pipeline on the 130-seed INDELible benchmark (TRUE-relative): the ensemble significantly beats contiguous k=5 (p=2.22×10⁻¹²) and k=9 (p=9.10×10⁻⁸), ties the best single-k (k=7, p=0.669), and — under the standard root-independent RF — also significantly beats the full spaced+NNI pipeline (0.1940 vs 0.1990, p=7.7×10⁻³), so at L=500 bp the ensemble (or contiguous k=7) is the recommended configuration rather than the default pipeline.</w:t>
       </w:r>
     </w:p>
     <w:p>

</xml_diff>

<commit_message>
Rebuild v3.1 DOCX on HEAD 79b760d (n=500/1000 clean cells now exact permutation 1.86e-9)
md carries 1.86e-9 17x (11 lines); the superseded normal-approximation
1.73e-6 is deliberately retained once in the Methods exact-permutation entry.
12 tables / 81 rows / 388 paragraphs.
</commit_message>
<xml_diff>
--- a/NAR_MANUSCRIPT_REVISED_v3.1.docx
+++ b/NAR_MANUSCRIPT_REVISED_v3.1.docx
@@ -2273,6 +2273,22 @@
           <w:sz w:val="24"/>
         </w:rPr>
         <w:t xml:space="preserve"> Wilcoxon signed-rank test reported in this manuscript, so no comparison is reported under whichever convention happens to favour it</w:t>
+      </w:r>
+    </w:p>
+    <w:p>
+      <w:pPr>
+        <w:pStyle w:val="ListBullet"/>
+        <w:spacing w:after="60" w:line="360" w:lineRule="auto"/>
+      </w:pPr>
+      <w:r>
+        <w:rPr>
+          <w:rFonts w:ascii="Times New Roman" w:hAnsi="Times New Roman" w:eastAsia="Times New Roman" w:cs="Times New Roman"/>
+          <w:b w:val="0"/>
+          <w:i w:val="0"/>
+          <w:color w:val="000000"/>
+          <w:sz w:val="24"/>
+        </w:rPr>
+        <w:t>Exact p-values for unanimous comparisons. The p-values above rely on the large-sample normal approximation with tie correction. Where a comparison is unanimous — every seed favouring the same method, with no discordant seed and no tie — the signed-rank statistic sits at its floor (W=0) and that approximation is unreliable: at W=0 the large-sample approximation returns 1.73×10⁻⁶ where the exact value is 1.86×10⁻⁹, i.e. the approximation is conservative by roughly three orders of magnitude. Unanimous comparisons are therefore reported at their exact value, obtained by enumerating the 2ⁿ equally likely sign assignments: W=0 requires all n signs to agree, which is one of the 2ⁿ assignments, giving a two-sided p of 2/2ⁿ (1.86×10⁻⁹ at n=30). This is the same signed-rank statistic evaluated exactly rather than approximately; ties in |d| do not affect the count, because W=0 constrains only the signs. It is used for the n=500 and n=1000 clean rows of Table 1 and for the Mash−Fusang comparisons of Table 2; every other comparison in this manuscript has W away from the floor and is reported under the zero-split normal approximation above</w:t>
       </w:r>
     </w:p>
     <w:p>
@@ -4399,7 +4415,7 @@
                 <w:color w:val="000000"/>
                 <w:sz w:val="18"/>
               </w:rPr>
-              <w:t>FT2 (p=1.73×10⁻⁶)</w:t>
+              <w:t>FT2 (p=1.86×10⁻⁹)</w:t>
             </w:r>
           </w:p>
         </w:tc>
@@ -4603,7 +4619,7 @@
                 <w:color w:val="000000"/>
                 <w:sz w:val="18"/>
               </w:rPr>
-              <w:t>FT2 (p=1.73×10⁻⁶)</w:t>
+              <w:t>FT2 (p=1.86×10⁻⁹)</w:t>
             </w:r>
           </w:p>
         </w:tc>
@@ -4749,6 +4765,61 @@
           <w:sz w:val="24"/>
         </w:rPr>
         <w:t>. Values are mean ± standard deviation, computed with the root-independent (unrooted) RF definition given in the Methods. Seed counts differ by condition: 130 seeds for n=200 (clean: seeds 100–229; indel: seeds 100–229), 30 seeds for n=500 and n=1000. All nRF values are TRUE-relative (vs the simulated ground-truth tree).</w:t>
+      </w:r>
+    </w:p>
+    <w:p>
+      <w:pPr>
+        <w:spacing w:after="120" w:line="360" w:lineRule="auto"/>
+      </w:pPr>
+      <w:r>
+        <w:rPr>
+          <w:rFonts w:ascii="Times New Roman" w:hAnsi="Times New Roman" w:eastAsia="Times New Roman" w:cs="Times New Roman"/>
+          <w:b w:val="0"/>
+          <w:i w:val="0"/>
+          <w:color w:val="000000"/>
+          <w:sz w:val="24"/>
+        </w:rPr>
+        <w:t xml:space="preserve">‡ The n=500 and n=1000 clean rows carry the </w:t>
+      </w:r>
+      <w:r>
+        <w:rPr>
+          <w:rFonts w:ascii="Times New Roman" w:hAnsi="Times New Roman" w:eastAsia="Times New Roman" w:cs="Times New Roman"/>
+          <w:b w:val="0"/>
+          <w:i/>
+          <w:color w:val="000000"/>
+          <w:sz w:val="24"/>
+        </w:rPr>
+        <w:t>same</w:t>
+      </w:r>
+      <w:r>
+        <w:rPr>
+          <w:rFonts w:ascii="Times New Roman" w:hAnsi="Times New Roman" w:eastAsia="Times New Roman" w:cs="Times New Roman"/>
+          <w:b w:val="0"/>
+          <w:i w:val="0"/>
+          <w:color w:val="000000"/>
+          <w:sz w:val="24"/>
+        </w:rPr>
+        <w:t xml:space="preserve"> p-value because the two comparisons are unanimous in the same way: in each, all 30 seeds favour FastTree2 (Fusang better in 0/30, no ties), so the signed-rank statistic sits at its floor (W=0) and, at equal seed count, the two rows share a single exact value. This is a property of a discrete test statistic, not a transcription error. Both rows are reported as </w:t>
+      </w:r>
+      <w:r>
+        <w:rPr>
+          <w:rFonts w:ascii="Times New Roman" w:hAnsi="Times New Roman" w:eastAsia="Times New Roman" w:cs="Times New Roman"/>
+          <w:b/>
+          <w:i w:val="0"/>
+          <w:color w:val="000000"/>
+          <w:sz w:val="24"/>
+        </w:rPr>
+        <w:t>exact sign-flip permutation</w:t>
+      </w:r>
+      <w:r>
+        <w:rPr>
+          <w:rFonts w:ascii="Times New Roman" w:hAnsi="Times New Roman" w:eastAsia="Times New Roman" w:cs="Times New Roman"/>
+          <w:b w:val="0"/>
+          <w:i w:val="0"/>
+          <w:color w:val="000000"/>
+          <w:sz w:val="24"/>
+        </w:rPr>
+        <w:t xml:space="preserve"> p-values (2/2³⁰ = 1.86×10⁻⁹) rather than as normal-approximation values: at W=0 the large-sample approximation breaks down in the extreme tail and is conservative here by nearly three orders of magnitude (see the Methods statistical framework). All other p-values in this table come from comparisons whose statistic is away from the floor and are reported under the tie-corrected zero-split normal approximation described in the Methods.</w:t>
       </w:r>
     </w:p>
     <w:p>
@@ -5289,7 +5360,7 @@
           <w:color w:val="000000"/>
           <w:sz w:val="24"/>
         </w:rPr>
-        <w:t xml:space="preserve"> accurate under indels. Paired Mash − Fusang comparison (positive = Mash worse): clean +0.1122 (Wilcoxon p=1.73×10⁻⁶; sign-flip permutation p=1.86×10⁻⁹; paired Cohen's d=3.123; Fusang better in 30/30 seeds), indel +0.2108 (p=1.86×10⁻⁹; d=2.615; Fusang better in 30/30 seeds). A 130-seed sensitivity run over the full seed range (seeds 100–229) gives the same picture (Fusang 0.2343 clean / 0.1990 indel; Mash 0.3529 / 0.4075; Fusang better in 130/130 seeds in both conditions), so the conclusion is not driven by seed count. Mash v2.3 (</w:t>
+        <w:t xml:space="preserve"> accurate under indels. Paired Mash − Fusang comparison (positive = Mash worse): clean +0.1122 (p=1.86×10⁻⁹; paired Cohen's d=3.123; Fusang better in 30/30 seeds), indel +0.2108 (p=1.86×10⁻⁹; d=2.615; Fusang better in 30/30 seeds). Both Mash−Fusang comparisons are unanimous (Fusang better in 30/30 seeds, no ties in either condition), so both are reported as exact sign-flip permutation p-values (2/2³⁰ = 1.86×10⁻⁹) rather than as normal-approximation values — the same convention as the two unanimous clean rows of Table 1. A 130-seed sensitivity run over the full seed range (seeds 100–229) gives the same picture (Fusang 0.2343 clean / 0.1990 indel; Mash 0.3529 / 0.4075; Fusang better in 130/130 seeds in both conditions), so the conclusion is not driven by seed count. Mash v2.3 (</w:t>
       </w:r>
       <w:r>
         <w:rPr>
@@ -10953,7 +11024,7 @@
           <w:color w:val="000000"/>
           <w:sz w:val="24"/>
         </w:rPr>
-        <w:t xml:space="preserve"> routes n&gt;500 to DCM (see the pipeline caveat in Discussion) — achieves TRUE-relative nRF=0.226 ± 0.015 vs FastTree2 0.212 ± 0.014 (paired Wilcoxon p=1.54×10⁻⁴; FastTree2 is significantly better, and the earlier claim of statistical indistinguishability — 0.133 ± 0.010 vs 0.131 ± 0.009, p=0.38 — is withdrawn as a product of the superseded nRF implementation; Table 1). The marginal, non-significant Fusang advantage observed at n=200 (p=0.0507) therefore reverses with increasing taxon count rather than extrapolating to n=1000: the indel-robustness benefit is confined to gene-family scale (n=200), while the FastTree2 advantage on clean data is significant at every scale tested (n=500: p=1.73×10⁻⁶; n=1000: p=1.73×10⁻⁶). This scale-dependence is itself practically informative: alignment-free inference is most competitive exactly in the regime where indels are frequent and taxon counts are moderate.</w:t>
+        <w:t xml:space="preserve"> routes n&gt;500 to DCM (see the pipeline caveat in Discussion) — achieves TRUE-relative nRF=0.226 ± 0.015 vs FastTree2 0.212 ± 0.014 (paired Wilcoxon p=1.54×10⁻⁴; FastTree2 is significantly better, and the earlier claim of statistical indistinguishability — 0.133 ± 0.010 vs 0.131 ± 0.009, p=0.38 — is withdrawn as a product of the superseded nRF implementation; Table 1). The marginal, non-significant Fusang advantage observed at n=200 (p=0.0507) therefore reverses with increasing taxon count rather than extrapolating to n=1000: the indel-robustness benefit is confined to gene-family scale (n=200), while the FastTree2 advantage on clean data is significant at every scale tested (n=500: p=1.86×10⁻⁹; n=1000: p=1.86×10⁻⁹). The two values coincide because both comparisons are unanimous — every one of the 30 seeds favours FastTree2, with no discordant seed and no tie — so the signed-rank statistic is at its floor (W=0) in both and the exact permutation value depends only on the seed count, which is the same; the coincidence is a property of the discrete statistic, not a transcription error (note to Table 1). This scale-dependence is itself practically informative: alignment-free inference is most competitive exactly in the regime where indels are frequent and taxon counts are moderate.</w:t>
       </w:r>
     </w:p>
     <w:p>
@@ -11627,7 +11698,7 @@
                 <w:color w:val="000000"/>
                 <w:sz w:val="18"/>
               </w:rPr>
-              <w:t>FT2 better (clean, p=1.73×10⁻⁶)</w:t>
+              <w:t>FT2 better (clean, p=1.86×10⁻⁹)</w:t>
             </w:r>
           </w:p>
         </w:tc>
@@ -11729,7 +11800,7 @@
                 <w:color w:val="000000"/>
                 <w:sz w:val="18"/>
               </w:rPr>
-              <w:t>FT2 better (clean, p=1.73×10⁻⁶)</w:t>
+              <w:t>FT2 better (clean, p=1.86×10⁻⁹)</w:t>
             </w:r>
           </w:p>
         </w:tc>
@@ -16205,7 +16276,7 @@
           <w:color w:val="000000"/>
           <w:sz w:val="24"/>
         </w:rPr>
-        <w:t xml:space="preserve">: On clean (no-indel) data, MSA-based methods maintain a clear advantage at every scale tested. A 30-seed benchmark at n=500 shows Fusang nRF=0.244 ± 0.019 vs FastTree2 nRF=0.213 ± 0.017 (paired Cohen's d=2.17, Wilcoxon p=1.73×10⁻⁶); at n=1000 the gap widens to 0.257 ± 0.019 vs 0.212 ± 0.016 (d=3.50, p=1.73×10⁻⁶); and at n=200 FastTree2 is also significantly better (0.234 ± 0.035 vs 0.210 ± 0.034, p=2.07×10⁻¹⁴). After Bonferroni correction across the six ground-truth datasets (α≈0.008), every clean-data comparison remains significant in favour of FastTree2. This is expected: on clean data without indels, alignment-based ML methods benefit from full positional information. </w:t>
+        <w:t xml:space="preserve">: On clean (no-indel) data, MSA-based methods maintain a clear advantage at every scale tested. A 30-seed benchmark at n=500 shows Fusang nRF=0.244 ± 0.019 vs FastTree2 nRF=0.213 ± 0.017 (paired Cohen's d=2.17, exact sign-flip permutation p=1.86×10⁻⁹); at n=1000 the gap widens to 0.257 ± 0.019 vs 0.212 ± 0.016 (d=3.50, p=1.86×10⁻⁹); and at n=200 FastTree2 is also significantly better (0.234 ± 0.035 vs 0.210 ± 0.034, p=2.07×10⁻¹⁴). After Bonferroni correction across the six ground-truth datasets (α≈0.008), every clean-data comparison remains significant in favour of FastTree2. This is expected: on clean data without indels, alignment-based ML methods benefit from full positional information. </w:t>
       </w:r>
       <w:r>
         <w:rPr>
@@ -16580,7 +16651,7 @@
           <w:color w:val="000000"/>
           <w:sz w:val="24"/>
         </w:rPr>
-        <w:t>: Multi-seed benchmarking at n=500 and n=1000 (30 seeds each) has been completed for both clean and indel-rich data, all TRUE-relative. At n=1000 indel, FastTree2 is significantly better (Fusang 0.226 ± 0.015 vs 0.212 ± 0.014, p=1.54×10⁻⁴, paired d=0.98), reversing the marginal n=200 indel advantage; at n=500 indel the two are indistinguishable (0.208 ± 0.019 vs 0.209 ± 0.017, p=0.294). A multiple-comparison correction across the six ground-truth datasets confirms that on clean data FastTree2 significantly outperforms Fusang at every scale (n=200: p=2.07×10⁻¹⁴; n=500: p=1.73×10⁻⁶; n=1000: p=1.73×10⁻⁶; all survive Bonferroni α≈0.008), while on indel-rich data FastTree2 is significantly better at n=1000 (p=1.54×10⁻⁴), the two are tied at n=500 and n=500-indel, and Fusang is numerically better only at n=200 (p=0.0507, which is not significant at α=0.05 and does not survive correction) (Supplementary Table S8).</w:t>
+        <w:t>: Multi-seed benchmarking at n=500 and n=1000 (30 seeds each) has been completed for both clean and indel-rich data, all TRUE-relative. At n=1000 indel, FastTree2 is significantly better (Fusang 0.226 ± 0.015 vs 0.212 ± 0.014, p=1.54×10⁻⁴, paired d=0.98), reversing the marginal n=200 indel advantage; at n=500 indel the two are indistinguishable (0.208 ± 0.019 vs 0.209 ± 0.017, p=0.294). A multiple-comparison correction across the six ground-truth datasets confirms that on clean data FastTree2 significantly outperforms Fusang at every scale (n=200: p=2.07×10⁻¹⁴; n=500: p=1.86×10⁻⁹; n=1000: p=1.86×10⁻⁹; all survive Bonferroni α≈0.008), while on indel-rich data FastTree2 is significantly better at n=1000 (p=1.54×10⁻⁴), the two are tied at n=500 and n=500-indel, and Fusang is numerically better only at n=200 (p=0.0507, which is not significant at α=0.05 and does not survive correction) (Supplementary Table S8).</w:t>
       </w:r>
     </w:p>
     <w:p>
@@ -16723,7 +16794,7 @@
           <w:color w:val="000000"/>
           <w:sz w:val="24"/>
         </w:rPr>
-        <w:t>: Mash (MinHash Jaccard, k=21) is far less accurate than k-mer cosine distances. The 30-seed benchmark (Table 2) shows Mash nRF=0.3486 ± 0.0351 vs Fusang nRF=0.2364 ± 0.0336 on clean data (Mash worse by +0.1122, paired Wilcoxon p=1.73×10⁻⁶, d=3.12, Fusang better in 30/30 seeds); the earlier figures (0.394 vs 0.376) came from the defective simulator and are withdrawn. K-mer cosine distances (Fusang) are the recommended alignment-free approach for both clean and indel-rich data, with the caveat that on clean data MSA+ML remains significantly more accurate than any alignment-free configuration we tested (Table 1).</w:t>
+        <w:t>: Mash (MinHash Jaccard, k=21) is far less accurate than k-mer cosine distances. The 30-seed benchmark (Table 2) shows Mash nRF=0.3486 ± 0.0351 vs Fusang nRF=0.2364 ± 0.0336 on clean data (Mash worse by +0.1122, p=1.86×10⁻⁹, d=3.12, Fusang better in 30/30 seeds); the earlier figures (0.394 vs 0.376) came from the defective simulator and are withdrawn. K-mer cosine distances (Fusang) are the recommended alignment-free approach for both clean and indel-rich data, with the caveat that on clean data MSA+ML remains significantly more accurate than any alignment-free configuration we tested (Table 1).</w:t>
       </w:r>
     </w:p>
     <w:p>

</xml_diff>